<commit_message>
Add repo rules, sanitization script, and theory of operations docs
- Repo_Rules: code standards, waiver compliance, sanitization procedures
- sanitize_before_push.py: ported from V1, updated for V2 terms
- Theory of Operations (Non-Technical): operator/stakeholder audience
- Theory of Operations (Technical): engineer/admin audience
- All docs in md + docx format, sanitized for remote push
</commit_message>
<xml_diff>
--- a/docs/Requested_Waivers_2026-04-04.docx
+++ b/docs/Requested_Waivers_2026-04-04.docx
@@ -568,7 +568,7 @@
           <w:rFonts w:ascii="Consolas" w:hAnsi="Consolas"/>
           <w:sz w:val="20"/>
         </w:rPr>
-        <w:t>Security  |  MIT license. IBM is an established US defense contractor with existing FedRAMP authorizations. Granite-Docling-258M model is Apache 2.0. No telemetry. No outbound connections.</w:t>
+        <w:t>Security  |  MIT license. IBM is an established US enterprise with existing FedRAMP authorizations. Granite-Docling-258M model is Apache 2.0. No telemetry. No outbound connections.</w:t>
       </w:r>
     </w:p>
     <w:p>
@@ -609,7 +609,7 @@
         <w:br/>
         <w:t>telemetry, zero outbound network activity. Processes documents</w:t>
         <w:br/>
-        <w:t>entirely in-process. IBM is an established US defense contractor with</w:t>
+        <w:t>entirely in-process. IBM is an established US enterprise with</w:t>
         <w:br/>
         <w:t>existing FedRAMP authorizations. docling has zero known CVEs on the</w:t>
         <w:br/>

</xml_diff>